<commit_message>
Update resume for platform leadership roles
</commit_message>
<xml_diff>
--- a/tranzha.docx
+++ b/tranzha.docx
@@ -401,7 +401,7 @@
           <w:color w:val="222222"/>
           <w:sz w:val="20"/>
         </w:rPr>
-        <w:t>Partnering with product, architecture and frontend teams to introduce a new Material UI based design system while preserving legacy interoperability during migration.</w:t>
+        <w:t>Partnering with product, architecture and frontend teams to introduce a new Material UI-based design system while preserving legacy interoperability during migration.</w:t>
       </w:r>
     </w:p>
     <w:p>
@@ -572,7 +572,7 @@
           <w:color w:val="222222"/>
           <w:sz w:val="21"/>
         </w:rPr>
-        <w:t>LMG / NZFSG - Senior DevOps Engineer / Senior Engineer / Engineering Manager, MyCRM Launch and Cloud Modernisation</w:t>
+        <w:t>NZFSG - Senior DevOps Engineer / Senior Engineer, MyCRM Launch and Cloud Modernisation</w:t>
       </w:r>
     </w:p>
     <w:p>
@@ -586,7 +586,7 @@
           <w:color w:val="555555"/>
           <w:sz w:val="19"/>
         </w:rPr>
-        <w:t>Apr 2016 - Apr 2021</w:t>
+        <w:t>Apr 2016 - Jun 2019</w:t>
       </w:r>
     </w:p>
     <w:p>
@@ -602,7 +602,7 @@
           <w:color w:val="222222"/>
           <w:sz w:val="20"/>
         </w:rPr>
-        <w:t>Helped rebuild, launch and modernise MyCRM across Australia/New Zealand; migrated from Windows/IIS/on-premise to AWS, containerisation and Kubernetes/EKS migrations, CI/CD and improved operational observability.</w:t>
+        <w:t>Helped rebuild, launch and modernise MyCRM across Australia/New Zealand; migrated from Windows/IIS/on-premise to AWS, CI/CD and improved operational observability; coordinated security audit activity and supported offshore expansion from 0 to 20+ engineers and QA staff.</w:t>
       </w:r>
     </w:p>
     <w:p>
@@ -618,7 +618,68 @@
           <w:color w:val="222222"/>
           <w:sz w:val="20"/>
         </w:rPr>
-        <w:t>Introduced OpenTelemetry, contextual logging, GitHub Actions, Octopus and improved local development workflows; coordinated security audit activity and supported offshore expansion from 0 to 20+ engineers and QAs.</w:t>
+        <w:t>Managed cloud spend, software licensing and vendor cost inputs for the MyCRM platform, balancing operational needs with budget and delivery priorities.</w:t>
+      </w:r>
+    </w:p>
+    <w:p>
+      <w:pPr>
+        <w:pStyle w:val="ListBullet"/>
+        <w:spacing w:after="60" w:line="259" w:lineRule="auto"/>
+        <w:ind w:left="360" w:hanging="360"/>
+      </w:pPr>
+      <w:r>
+        <w:rPr>
+          <w:rFonts w:ascii="Calibri" w:hAnsi="Calibri" w:eastAsia="Calibri"/>
+          <w:b w:val="0"/>
+          <w:color w:val="222222"/>
+          <w:sz w:val="20"/>
+        </w:rPr>
+        <w:t>Supported production operations, incident response and service reliability for business-critical CRM systems, using monitoring and support feedback to drive continuous improvement.</w:t>
+      </w:r>
+    </w:p>
+    <w:p>
+      <w:pPr>
+        <w:pStyle w:val="Heading2"/>
+        <w:spacing w:before="140" w:after="20" w:line="240" w:lineRule="auto"/>
+      </w:pPr>
+      <w:r>
+        <w:rPr>
+          <w:rFonts w:ascii="Calibri" w:hAnsi="Calibri" w:eastAsia="Calibri"/>
+          <w:b/>
+          <w:color w:val="222222"/>
+          <w:sz w:val="21"/>
+        </w:rPr>
+        <w:t>LMG / Loan Market Group - Engineering Manager, MyCRM Platform Modernisation</w:t>
+      </w:r>
+    </w:p>
+    <w:p>
+      <w:pPr>
+        <w:spacing w:before="0" w:after="80" w:line="240" w:lineRule="auto"/>
+      </w:pPr>
+      <w:r>
+        <w:rPr>
+          <w:rFonts w:ascii="Calibri" w:hAnsi="Calibri" w:eastAsia="Calibri"/>
+          <w:b/>
+          <w:color w:val="555555"/>
+          <w:sz w:val="19"/>
+        </w:rPr>
+        <w:t>Jul 2019 - Apr 2021</w:t>
+      </w:r>
+    </w:p>
+    <w:p>
+      <w:pPr>
+        <w:pStyle w:val="ListBullet"/>
+        <w:spacing w:after="60" w:line="259" w:lineRule="auto"/>
+        <w:ind w:left="360" w:hanging="360"/>
+      </w:pPr>
+      <w:r>
+        <w:rPr>
+          <w:rFonts w:ascii="Calibri" w:hAnsi="Calibri" w:eastAsia="Calibri"/>
+          <w:b w:val="0"/>
+          <w:color w:val="222222"/>
+          <w:sz w:val="20"/>
+        </w:rPr>
+        <w:t>Introduced OpenTelemetry, contextual logging, GitHub Actions and Octopus, improved local development workflows, and led containerisation and Kubernetes/EKS migrations.</w:t>
       </w:r>
     </w:p>
     <w:p>

</xml_diff>

<commit_message>
Fix resume chronology order
</commit_message>
<xml_diff>
--- a/tranzha.docx
+++ b/tranzha.docx
@@ -572,6 +572,51 @@
           <w:color w:val="222222"/>
           <w:sz w:val="21"/>
         </w:rPr>
+        <w:t>LMG / Loan Market Group - Engineering Manager, MyCRM Platform Modernisation</w:t>
+      </w:r>
+    </w:p>
+    <w:p>
+      <w:pPr>
+        <w:spacing w:before="0" w:after="80" w:line="240" w:lineRule="auto"/>
+      </w:pPr>
+      <w:r>
+        <w:rPr>
+          <w:rFonts w:ascii="Calibri" w:hAnsi="Calibri" w:eastAsia="Calibri"/>
+          <w:b/>
+          <w:color w:val="555555"/>
+          <w:sz w:val="19"/>
+        </w:rPr>
+        <w:t>Jul 2019 - Apr 2021</w:t>
+      </w:r>
+    </w:p>
+    <w:p>
+      <w:pPr>
+        <w:pStyle w:val="ListBullet"/>
+        <w:spacing w:after="60" w:line="259" w:lineRule="auto"/>
+        <w:ind w:left="360" w:hanging="360"/>
+      </w:pPr>
+      <w:r>
+        <w:rPr>
+          <w:rFonts w:ascii="Calibri" w:hAnsi="Calibri" w:eastAsia="Calibri"/>
+          <w:b w:val="0"/>
+          <w:color w:val="222222"/>
+          <w:sz w:val="20"/>
+        </w:rPr>
+        <w:t>Introduced OpenTelemetry, contextual logging, GitHub Actions and Octopus, improved local development workflows, and led containerisation and Kubernetes/EKS migrations.</w:t>
+      </w:r>
+    </w:p>
+    <w:p>
+      <w:pPr>
+        <w:pStyle w:val="Heading2"/>
+        <w:spacing w:before="140" w:after="20" w:line="240" w:lineRule="auto"/>
+      </w:pPr>
+      <w:r>
+        <w:rPr>
+          <w:rFonts w:ascii="Calibri" w:hAnsi="Calibri" w:eastAsia="Calibri"/>
+          <w:b/>
+          <w:color w:val="222222"/>
+          <w:sz w:val="21"/>
+        </w:rPr>
         <w:t>NZFSG - Senior DevOps Engineer / Senior Engineer, MyCRM Launch and Cloud Modernisation</w:t>
       </w:r>
     </w:p>
@@ -635,51 +680,6 @@
           <w:sz w:val="20"/>
         </w:rPr>
         <w:t>Supported production operations, incident response and service reliability for business-critical CRM systems, using monitoring and support feedback to drive continuous improvement.</w:t>
-      </w:r>
-    </w:p>
-    <w:p>
-      <w:pPr>
-        <w:pStyle w:val="Heading2"/>
-        <w:spacing w:before="140" w:after="20" w:line="240" w:lineRule="auto"/>
-      </w:pPr>
-      <w:r>
-        <w:rPr>
-          <w:rFonts w:ascii="Calibri" w:hAnsi="Calibri" w:eastAsia="Calibri"/>
-          <w:b/>
-          <w:color w:val="222222"/>
-          <w:sz w:val="21"/>
-        </w:rPr>
-        <w:t>LMG / Loan Market Group - Engineering Manager, MyCRM Platform Modernisation</w:t>
-      </w:r>
-    </w:p>
-    <w:p>
-      <w:pPr>
-        <w:spacing w:before="0" w:after="80" w:line="240" w:lineRule="auto"/>
-      </w:pPr>
-      <w:r>
-        <w:rPr>
-          <w:rFonts w:ascii="Calibri" w:hAnsi="Calibri" w:eastAsia="Calibri"/>
-          <w:b/>
-          <w:color w:val="555555"/>
-          <w:sz w:val="19"/>
-        </w:rPr>
-        <w:t>Jul 2019 - Apr 2021</w:t>
-      </w:r>
-    </w:p>
-    <w:p>
-      <w:pPr>
-        <w:pStyle w:val="ListBullet"/>
-        <w:spacing w:after="60" w:line="259" w:lineRule="auto"/>
-        <w:ind w:left="360" w:hanging="360"/>
-      </w:pPr>
-      <w:r>
-        <w:rPr>
-          <w:rFonts w:ascii="Calibri" w:hAnsi="Calibri" w:eastAsia="Calibri"/>
-          <w:b w:val="0"/>
-          <w:color w:val="222222"/>
-          <w:sz w:val="20"/>
-        </w:rPr>
-        <w:t>Introduced OpenTelemetry, contextual logging, GitHub Actions and Octopus, improved local development workflows, and led containerisation and Kubernetes/EKS migrations.</w:t>
       </w:r>
     </w:p>
     <w:p>

</xml_diff>

<commit_message>
skills relocation; resume updates
</commit_message>
<xml_diff>
--- a/tranzha.docx
+++ b/tranzha.docx
@@ -260,7 +260,7 @@
           <w:sz w:val="19"/>
           <w:u w:val="none"/>
         </w:rPr>
-        <w:t xml:space="preserve"> Strangler Fig migration, monolith decomposition, service boundaries, backward compatibility, REST APIs, CQRS, event driven architecture, gRPC, clean architecture, Vertical Slice Architecture and domain modelling.</w:t>
+        <w:t xml:space="preserve"> Strangler Fig migration, monolith decomposition, service boundaries, backward compatibility, REST APIs, CQRS, event-driven architecture, event sourcing, projection-based migrations, gRPC, clean architecture, Vertical Slice Architecture and domain modelling.</w:t>
       </w:r>
     </w:p>
     <w:p>
@@ -277,7 +277,7 @@
           <w:sz w:val="19"/>
           <w:u w:val="none"/>
         </w:rPr>
-        <w:t>Cloud, DevOps and data:</w:t>
+        <w:t>Cloud, DevOps, security and data:</w:t>
       </w:r>
       <w:r>
         <w:rPr>
@@ -287,7 +287,7 @@
           <w:sz w:val="19"/>
           <w:u w:val="none"/>
         </w:rPr>
-        <w:t xml:space="preserve"> AWS, GCP, Kubernetes, EKS, Docker, GitHub Actions, Octopus, OpenTelemetry, observability, incident response, service reliability, SQL Server, PostgreSQL, Snowflake, BigQuery and data migration.</w:t>
+        <w:t xml:space="preserve"> AWS, GCP, Kubernetes, EKS, Docker, GitHub Actions, Octopus, OpenTelemetry, observability, incident response, service reliability, PII data handling, ISO 27001 (ISO27001) and SOC 2 Type II (SOC2 Type 2)-aligned engineering practices, SQL Server, PostgreSQL, Snowflake, BigQuery and data migration.</w:t>
       </w:r>
     </w:p>
     <w:p>
@@ -415,7 +415,7 @@
           <w:sz w:val="19"/>
           <w:u w:val="none"/>
         </w:rPr>
-        <w:t xml:space="preserve"> Defines goals, boundaries, operating agreements and measurable success criteria, making "good" concrete and reducing tangents.</w:t>
+        <w:t xml:space="preserve"> Defines goals, boundaries, operating agreements, measurable success criteria, reusable skills and workflows, making "good" concrete so LLM harnesses and teams improve over iterations.</w:t>
       </w:r>
     </w:p>
     <w:p>
@@ -442,7 +442,7 @@
           <w:sz w:val="19"/>
           <w:u w:val="none"/>
         </w:rPr>
-        <w:t xml:space="preserve"> Sets clear goals, then drives build, test, verify, deploy and feedback loops so teams can make local decisions without micromanagement.</w:t>
+        <w:t xml:space="preserve"> Uplifts teams through effective delegation, mentoring, capacity building and tight build, test, verify, deploy and feedback loops, helping people make local decisions and working myself out of the job.</w:t>
       </w:r>
     </w:p>
     <w:p>
@@ -649,6 +649,23 @@
           <w:u w:val="none"/>
         </w:rPr>
         <w:t>Used the Engagement platform to launch asset finance, commercial and insurance deal journeys, expanding MyCRM beyond residential lending without duplicating core deal logic.</w:t>
+      </w:r>
+    </w:p>
+    <w:p>
+      <w:pPr>
+        <w:pStyle w:val="ListBullet"/>
+        <w:spacing w:after="40" w:line="247" w:lineRule="auto"/>
+        <w:ind w:left="360" w:hanging="360"/>
+      </w:pPr>
+      <w:r>
+        <w:rPr>
+          <w:rFonts w:ascii="Calibri" w:hAnsi="Calibri" w:eastAsia="Calibri"/>
+          <w:b w:val="0"/>
+          <w:color w:val="222222"/>
+          <w:sz w:val="19"/>
+          <w:u w:val="none"/>
+        </w:rPr>
+        <w:t>Applied event-driven architecture and event-sourcing patterns with backward-compatible projections, allowing legacy and new deal journeys to evolve without breaking consumers.</w:t>
       </w:r>
     </w:p>
     <w:p>

</xml_diff>

<commit_message>
resume changes, skill update, practice .net
</commit_message>
<xml_diff>
--- a/tranzha.docx
+++ b/tranzha.docx
@@ -159,7 +159,22 @@
           <w:sz w:val="20"/>
           <w:u w:val="none"/>
         </w:rPr>
-        <w:t>Engineering Manager and hands-on software engineering leader with 15+ years of experience building software products, leading teams and modernising complex platforms. I help teams make sense of messy legacy systems, turn unclear problems into practical delivery plans, and keep business-critical work moving without losing sight of quality. My leadership style mirrors effective LLM engineering: clear intent, enough context, practical guardrails, measurable success and tight feedback loops. I use LLM tools in work and personal projects to speed up research, prototyping, documentation and analysis, while keeping human review and engineering judgement at the centre.</w:t>
+        <w:t>Engineering Manager and hands-on software engineering leader with 15+ years of experience building software products, leading teams and modernising complex platforms. I help teams make sense of messy legacy systems, turn unclear problems into practical delivery plans, and keep business-critical work moving without losing sight of quality.</w:t>
+      </w:r>
+    </w:p>
+    <w:p>
+      <w:pPr>
+        <w:spacing w:before="0" w:after="120" w:line="264" w:lineRule="auto"/>
+      </w:pPr>
+      <w:r>
+        <w:rPr>
+          <w:rFonts w:ascii="Calibri" w:hAnsi="Calibri" w:eastAsia="Calibri"/>
+          <w:b w:val="0"/>
+          <w:color w:val="222222"/>
+          <w:sz w:val="20"/>
+          <w:u w:val="none"/>
+        </w:rPr>
+        <w:t>My leadership style mirrors effective LLM engineering: clear intent, enough context, practical guardrails, measurable success and tight feedback loops. I use LLM tools in work and personal projects to speed up research, prototyping, documentation and analysis, while keeping human review and engineering judgement at the centre.</w:t>
       </w:r>
     </w:p>
     <w:p>

</xml_diff>